<commit_message>
Rilascio DOCUMENTAZIONE MEV_2023-035 2024-12-05
</commit_message>
<xml_diff>
--- a/MEV/SCHEDA_035/ORIGINALI/SIUT-SIES-PR-1.0-20240830-Piano_di_Rilascio_2023_035_SIUS_Riforma_Cartabia.docx
+++ b/MEV/SCHEDA_035/ORIGINALI/SIUT-SIES-PR-1.0-20240830-Piano_di_Rilascio_2023_035_SIUS_Riforma_Cartabia.docx
@@ -185,8 +185,8 @@
     </w:tbl>
     <w:bookmarkStart w:id="1" w:name="_Hlk14967838" w:displacedByCustomXml="next"/>
     <w:bookmarkEnd w:id="1" w:displacedByCustomXml="next"/>
-    <w:bookmarkStart w:id="2" w:name="_Hlk10713674" w:displacedByCustomXml="next"/>
-    <w:bookmarkStart w:id="3" w:name="_Hlk15306111" w:displacedByCustomXml="next"/>
+    <w:bookmarkStart w:id="2" w:name="_Hlk15306111" w:displacedByCustomXml="next"/>
+    <w:bookmarkStart w:id="3" w:name="_Hlk10713674" w:displacedByCustomXml="next"/>
     <w:sdt>
       <w:sdtPr>
         <w:rPr>
@@ -198,6 +198,7 @@
           <w:docPartUnique/>
         </w:docPartObj>
       </w:sdtPr>
+      <w:sdtEndPr/>
       <w:sdtContent>
         <w:p>
           <w:pPr>
@@ -3007,7 +3008,7 @@
         </w:rPr>
         <w:fldChar w:fldCharType="separate"/>
       </w:r>
-      <w:hyperlink w:anchor="_Toc175669469" w:history="1">
+      <w:hyperlink w:anchor="_Toc181798336" w:history="1">
         <w:r>
           <w:rPr>
             <w:rStyle w:val="Collegamentoipertestuale"/>
@@ -3054,7 +3055,7 @@
             <w:noProof/>
             <w:webHidden/>
           </w:rPr>
-          <w:instrText xml:space="preserve"> PAGEREF _Toc175669469 \h </w:instrText>
+          <w:instrText xml:space="preserve"> PAGEREF _Toc181798336 \h </w:instrText>
         </w:r>
         <w:r>
           <w:rPr>
@@ -3099,7 +3100,7 @@
           <w:szCs w:val="22"/>
         </w:rPr>
       </w:pPr>
-      <w:hyperlink w:anchor="_Toc175669470" w:history="1">
+      <w:hyperlink w:anchor="_Toc181798337" w:history="1">
         <w:r>
           <w:rPr>
             <w:rStyle w:val="Collegamentoipertestuale"/>
@@ -3139,7 +3140,7 @@
           <w:rPr>
             <w:webHidden/>
           </w:rPr>
-          <w:instrText xml:space="preserve"> PAGEREF _Toc175669470 \h </w:instrText>
+          <w:instrText xml:space="preserve"> PAGEREF _Toc181798337 \h </w:instrText>
         </w:r>
         <w:r>
           <w:rPr>
@@ -3180,7 +3181,7 @@
           <w:szCs w:val="22"/>
         </w:rPr>
       </w:pPr>
-      <w:hyperlink w:anchor="_Toc175669471" w:history="1">
+      <w:hyperlink w:anchor="_Toc181798338" w:history="1">
         <w:r>
           <w:rPr>
             <w:rStyle w:val="Collegamentoipertestuale"/>
@@ -3220,7 +3221,7 @@
           <w:rPr>
             <w:webHidden/>
           </w:rPr>
-          <w:instrText xml:space="preserve"> PAGEREF _Toc175669471 \h </w:instrText>
+          <w:instrText xml:space="preserve"> PAGEREF _Toc181798338 \h </w:instrText>
         </w:r>
         <w:r>
           <w:rPr>
@@ -3261,7 +3262,7 @@
           <w:szCs w:val="22"/>
         </w:rPr>
       </w:pPr>
-      <w:hyperlink w:anchor="_Toc175669472" w:history="1">
+      <w:hyperlink w:anchor="_Toc181798339" w:history="1">
         <w:r>
           <w:rPr>
             <w:rStyle w:val="Collegamentoipertestuale"/>
@@ -3301,7 +3302,7 @@
           <w:rPr>
             <w:webHidden/>
           </w:rPr>
-          <w:instrText xml:space="preserve"> PAGEREF _Toc175669472 \h </w:instrText>
+          <w:instrText xml:space="preserve"> PAGEREF _Toc181798339 \h </w:instrText>
         </w:r>
         <w:r>
           <w:rPr>
@@ -3342,7 +3343,7 @@
           <w:szCs w:val="22"/>
         </w:rPr>
       </w:pPr>
-      <w:hyperlink w:anchor="_Toc175669473" w:history="1">
+      <w:hyperlink w:anchor="_Toc181798340" w:history="1">
         <w:r>
           <w:rPr>
             <w:rStyle w:val="Collegamentoipertestuale"/>
@@ -3382,7 +3383,7 @@
           <w:rPr>
             <w:webHidden/>
           </w:rPr>
-          <w:instrText xml:space="preserve"> PAGEREF _Toc175669473 \h </w:instrText>
+          <w:instrText xml:space="preserve"> PAGEREF _Toc181798340 \h </w:instrText>
         </w:r>
         <w:r>
           <w:rPr>
@@ -3423,7 +3424,7 @@
           <w:szCs w:val="22"/>
         </w:rPr>
       </w:pPr>
-      <w:hyperlink w:anchor="_Toc175669474" w:history="1">
+      <w:hyperlink w:anchor="_Toc181798341" w:history="1">
         <w:r>
           <w:rPr>
             <w:rStyle w:val="Collegamentoipertestuale"/>
@@ -3463,7 +3464,7 @@
           <w:rPr>
             <w:webHidden/>
           </w:rPr>
-          <w:instrText xml:space="preserve"> PAGEREF _Toc175669474 \h </w:instrText>
+          <w:instrText xml:space="preserve"> PAGEREF _Toc181798341 \h </w:instrText>
         </w:r>
         <w:r>
           <w:rPr>
@@ -3506,7 +3507,7 @@
           <w:szCs w:val="22"/>
         </w:rPr>
       </w:pPr>
-      <w:hyperlink w:anchor="_Toc175669475" w:history="1">
+      <w:hyperlink w:anchor="_Toc181798342" w:history="1">
         <w:r>
           <w:rPr>
             <w:rStyle w:val="Collegamentoipertestuale"/>
@@ -3553,7 +3554,7 @@
             <w:noProof/>
             <w:webHidden/>
           </w:rPr>
-          <w:instrText xml:space="preserve"> PAGEREF _Toc175669475 \h </w:instrText>
+          <w:instrText xml:space="preserve"> PAGEREF _Toc181798342 \h </w:instrText>
         </w:r>
         <w:r>
           <w:rPr>
@@ -3600,7 +3601,7 @@
           <w:szCs w:val="22"/>
         </w:rPr>
       </w:pPr>
-      <w:hyperlink w:anchor="_Toc175669476" w:history="1">
+      <w:hyperlink w:anchor="_Toc181798343" w:history="1">
         <w:r>
           <w:rPr>
             <w:rStyle w:val="Collegamentoipertestuale"/>
@@ -3647,7 +3648,7 @@
             <w:noProof/>
             <w:webHidden/>
           </w:rPr>
-          <w:instrText xml:space="preserve"> PAGEREF _Toc175669476 \h </w:instrText>
+          <w:instrText xml:space="preserve"> PAGEREF _Toc181798343 \h </w:instrText>
         </w:r>
         <w:r>
           <w:rPr>
@@ -3694,7 +3695,7 @@
           <w:szCs w:val="22"/>
         </w:rPr>
       </w:pPr>
-      <w:hyperlink w:anchor="_Toc175669477" w:history="1">
+      <w:hyperlink w:anchor="_Toc181798344" w:history="1">
         <w:r>
           <w:rPr>
             <w:rStyle w:val="Collegamentoipertestuale"/>
@@ -3741,7 +3742,7 @@
             <w:noProof/>
             <w:webHidden/>
           </w:rPr>
-          <w:instrText xml:space="preserve"> PAGEREF _Toc175669477 \h </w:instrText>
+          <w:instrText xml:space="preserve"> PAGEREF _Toc181798344 \h </w:instrText>
         </w:r>
         <w:r>
           <w:rPr>
@@ -3786,7 +3787,7 @@
           <w:szCs w:val="22"/>
         </w:rPr>
       </w:pPr>
-      <w:hyperlink w:anchor="_Toc175669478" w:history="1">
+      <w:hyperlink w:anchor="_Toc181798345" w:history="1">
         <w:r>
           <w:rPr>
             <w:rStyle w:val="Collegamentoipertestuale"/>
@@ -3826,7 +3827,7 @@
           <w:rPr>
             <w:webHidden/>
           </w:rPr>
-          <w:instrText xml:space="preserve"> PAGEREF _Toc175669478 \h </w:instrText>
+          <w:instrText xml:space="preserve"> PAGEREF _Toc181798345 \h </w:instrText>
         </w:r>
         <w:r>
           <w:rPr>
@@ -3867,7 +3868,7 @@
           <w:szCs w:val="22"/>
         </w:rPr>
       </w:pPr>
-      <w:hyperlink w:anchor="_Toc175669479" w:history="1">
+      <w:hyperlink w:anchor="_Toc181798346" w:history="1">
         <w:r>
           <w:rPr>
             <w:rStyle w:val="Collegamentoipertestuale"/>
@@ -3907,7 +3908,7 @@
           <w:rPr>
             <w:webHidden/>
           </w:rPr>
-          <w:instrText xml:space="preserve"> PAGEREF _Toc175669479 \h </w:instrText>
+          <w:instrText xml:space="preserve"> PAGEREF _Toc181798346 \h </w:instrText>
         </w:r>
         <w:r>
           <w:rPr>
@@ -3950,7 +3951,7 @@
           <w:szCs w:val="22"/>
         </w:rPr>
       </w:pPr>
-      <w:hyperlink w:anchor="_Toc175669480" w:history="1">
+      <w:hyperlink w:anchor="_Toc181798347" w:history="1">
         <w:r>
           <w:rPr>
             <w:rStyle w:val="Collegamentoipertestuale"/>
@@ -3997,7 +3998,7 @@
             <w:noProof/>
             <w:webHidden/>
           </w:rPr>
-          <w:instrText xml:space="preserve"> PAGEREF _Toc175669480 \h </w:instrText>
+          <w:instrText xml:space="preserve"> PAGEREF _Toc181798347 \h </w:instrText>
         </w:r>
         <w:r>
           <w:rPr>
@@ -4044,7 +4045,7 @@
           <w:szCs w:val="22"/>
         </w:rPr>
       </w:pPr>
-      <w:hyperlink w:anchor="_Toc175669481" w:history="1">
+      <w:hyperlink w:anchor="_Toc181798348" w:history="1">
         <w:r>
           <w:rPr>
             <w:rStyle w:val="Collegamentoipertestuale"/>
@@ -4091,7 +4092,7 @@
             <w:noProof/>
             <w:webHidden/>
           </w:rPr>
-          <w:instrText xml:space="preserve"> PAGEREF _Toc175669481 \h </w:instrText>
+          <w:instrText xml:space="preserve"> PAGEREF _Toc181798348 \h </w:instrText>
         </w:r>
         <w:r>
           <w:rPr>
@@ -4136,7 +4137,7 @@
           <w:szCs w:val="22"/>
         </w:rPr>
       </w:pPr>
-      <w:hyperlink w:anchor="_Toc175669482" w:history="1">
+      <w:hyperlink w:anchor="_Toc181798349" w:history="1">
         <w:r>
           <w:rPr>
             <w:rStyle w:val="Collegamentoipertestuale"/>
@@ -4176,7 +4177,7 @@
           <w:rPr>
             <w:webHidden/>
           </w:rPr>
-          <w:instrText xml:space="preserve"> PAGEREF _Toc175669482 \h </w:instrText>
+          <w:instrText xml:space="preserve"> PAGEREF _Toc181798349 \h </w:instrText>
         </w:r>
         <w:r>
           <w:rPr>
@@ -4217,7 +4218,7 @@
           <w:szCs w:val="22"/>
         </w:rPr>
       </w:pPr>
-      <w:hyperlink w:anchor="_Toc175669483" w:history="1">
+      <w:hyperlink w:anchor="_Toc181798350" w:history="1">
         <w:r>
           <w:rPr>
             <w:rStyle w:val="Collegamentoipertestuale"/>
@@ -4257,7 +4258,7 @@
           <w:rPr>
             <w:webHidden/>
           </w:rPr>
-          <w:instrText xml:space="preserve"> PAGEREF _Toc175669483 \h </w:instrText>
+          <w:instrText xml:space="preserve"> PAGEREF _Toc181798350 \h </w:instrText>
         </w:r>
         <w:r>
           <w:rPr>
@@ -4298,7 +4299,7 @@
           <w:szCs w:val="22"/>
         </w:rPr>
       </w:pPr>
-      <w:hyperlink w:anchor="_Toc175669484" w:history="1">
+      <w:hyperlink w:anchor="_Toc181798351" w:history="1">
         <w:r>
           <w:rPr>
             <w:rStyle w:val="Collegamentoipertestuale"/>
@@ -4338,7 +4339,7 @@
           <w:rPr>
             <w:webHidden/>
           </w:rPr>
-          <w:instrText xml:space="preserve"> PAGEREF _Toc175669484 \h </w:instrText>
+          <w:instrText xml:space="preserve"> PAGEREF _Toc181798351 \h </w:instrText>
         </w:r>
         <w:r>
           <w:rPr>
@@ -4379,7 +4380,7 @@
           <w:szCs w:val="22"/>
         </w:rPr>
       </w:pPr>
-      <w:hyperlink w:anchor="_Toc175669485" w:history="1">
+      <w:hyperlink w:anchor="_Toc181798352" w:history="1">
         <w:r>
           <w:rPr>
             <w:rStyle w:val="Collegamentoipertestuale"/>
@@ -4419,7 +4420,7 @@
           <w:rPr>
             <w:webHidden/>
           </w:rPr>
-          <w:instrText xml:space="preserve"> PAGEREF _Toc175669485 \h </w:instrText>
+          <w:instrText xml:space="preserve"> PAGEREF _Toc181798352 \h </w:instrText>
         </w:r>
         <w:r>
           <w:rPr>
@@ -4460,7 +4461,7 @@
           <w:szCs w:val="22"/>
         </w:rPr>
       </w:pPr>
-      <w:hyperlink w:anchor="_Toc175669486" w:history="1">
+      <w:hyperlink w:anchor="_Toc181798353" w:history="1">
         <w:r>
           <w:rPr>
             <w:rStyle w:val="Collegamentoipertestuale"/>
@@ -4500,7 +4501,7 @@
           <w:rPr>
             <w:webHidden/>
           </w:rPr>
-          <w:instrText xml:space="preserve"> PAGEREF _Toc175669486 \h </w:instrText>
+          <w:instrText xml:space="preserve"> PAGEREF _Toc181798353 \h </w:instrText>
         </w:r>
         <w:r>
           <w:rPr>
@@ -4541,7 +4542,7 @@
           <w:szCs w:val="22"/>
         </w:rPr>
       </w:pPr>
-      <w:hyperlink w:anchor="_Toc175669487" w:history="1">
+      <w:hyperlink w:anchor="_Toc181798354" w:history="1">
         <w:r>
           <w:rPr>
             <w:rStyle w:val="Collegamentoipertestuale"/>
@@ -4581,7 +4582,7 @@
           <w:rPr>
             <w:webHidden/>
           </w:rPr>
-          <w:instrText xml:space="preserve"> PAGEREF _Toc175669487 \h </w:instrText>
+          <w:instrText xml:space="preserve"> PAGEREF _Toc181798354 \h </w:instrText>
         </w:r>
         <w:r>
           <w:rPr>
@@ -4622,7 +4623,7 @@
           <w:szCs w:val="22"/>
         </w:rPr>
       </w:pPr>
-      <w:hyperlink w:anchor="_Toc175669488" w:history="1">
+      <w:hyperlink w:anchor="_Toc181798355" w:history="1">
         <w:r>
           <w:rPr>
             <w:rStyle w:val="Collegamentoipertestuale"/>
@@ -4662,7 +4663,7 @@
           <w:rPr>
             <w:webHidden/>
           </w:rPr>
-          <w:instrText xml:space="preserve"> PAGEREF _Toc175669488 \h </w:instrText>
+          <w:instrText xml:space="preserve"> PAGEREF _Toc181798355 \h </w:instrText>
         </w:r>
         <w:r>
           <w:rPr>
@@ -4703,7 +4704,7 @@
           <w:szCs w:val="22"/>
         </w:rPr>
       </w:pPr>
-      <w:hyperlink w:anchor="_Toc175669489" w:history="1">
+      <w:hyperlink w:anchor="_Toc181798356" w:history="1">
         <w:r>
           <w:rPr>
             <w:rStyle w:val="Collegamentoipertestuale"/>
@@ -4743,7 +4744,7 @@
           <w:rPr>
             <w:webHidden/>
           </w:rPr>
-          <w:instrText xml:space="preserve"> PAGEREF _Toc175669489 \h </w:instrText>
+          <w:instrText xml:space="preserve"> PAGEREF _Toc181798356 \h </w:instrText>
         </w:r>
         <w:r>
           <w:rPr>
@@ -4784,7 +4785,7 @@
           <w:szCs w:val="22"/>
         </w:rPr>
       </w:pPr>
-      <w:hyperlink w:anchor="_Toc175669490" w:history="1">
+      <w:hyperlink w:anchor="_Toc181798357" w:history="1">
         <w:r>
           <w:rPr>
             <w:rStyle w:val="Collegamentoipertestuale"/>
@@ -4824,7 +4825,7 @@
           <w:rPr>
             <w:webHidden/>
           </w:rPr>
-          <w:instrText xml:space="preserve"> PAGEREF _Toc175669490 \h </w:instrText>
+          <w:instrText xml:space="preserve"> PAGEREF _Toc181798357 \h </w:instrText>
         </w:r>
         <w:r>
           <w:rPr>
@@ -4914,7 +4915,7 @@
       </w:pPr>
       <w:bookmarkStart w:id="13" w:name="_Toc330316535"/>
       <w:bookmarkStart w:id="14" w:name="_Toc8205263"/>
-      <w:bookmarkStart w:id="15" w:name="_Toc175669469"/>
+      <w:bookmarkStart w:id="15" w:name="_Toc181798336"/>
       <w:bookmarkEnd w:id="12"/>
       <w:r>
         <w:rPr>
@@ -4952,7 +4953,7 @@
       </w:pPr>
       <w:bookmarkStart w:id="16" w:name="_Toc330316536"/>
       <w:bookmarkStart w:id="17" w:name="_Toc8205264"/>
-      <w:bookmarkStart w:id="18" w:name="_Toc175669470"/>
+      <w:bookmarkStart w:id="18" w:name="_Toc181798337"/>
       <w:r>
         <w:rPr>
           <w:rFonts w:asciiTheme="minorHAnsi" w:hAnsiTheme="minorHAnsi" w:cstheme="minorHAnsi"/>
@@ -5114,7 +5115,7 @@
           <w:sz w:val="22"/>
           <w:szCs w:val="22"/>
         </w:rPr>
-        <w:t>12.6.2.0-MEV_2023_35</w:t>
+        <w:t>12.6.4.0-MEV_2023_35</w:t>
       </w:r>
       <w:r>
         <w:rPr>
@@ -5198,7 +5199,7 @@
         </w:rPr>
       </w:pPr>
       <w:bookmarkStart w:id="19" w:name="_Toc16251723"/>
-      <w:bookmarkStart w:id="20" w:name="_Toc175669471"/>
+      <w:bookmarkStart w:id="20" w:name="_Toc181798338"/>
       <w:r>
         <w:rPr>
           <w:rFonts w:asciiTheme="minorHAnsi" w:hAnsiTheme="minorHAnsi" w:cstheme="minorHAnsi"/>
@@ -5442,7 +5443,7 @@
           <w:szCs w:val="24"/>
         </w:rPr>
       </w:pPr>
-      <w:bookmarkStart w:id="21" w:name="_Toc175669472"/>
+      <w:bookmarkStart w:id="21" w:name="_Toc181798339"/>
       <w:r>
         <w:rPr>
           <w:rFonts w:asciiTheme="minorHAnsi" w:hAnsiTheme="minorHAnsi" w:cstheme="minorHAnsi"/>
@@ -5472,7 +5473,7 @@
           <w:szCs w:val="24"/>
         </w:rPr>
       </w:pPr>
-      <w:bookmarkStart w:id="22" w:name="_Toc175669473"/>
+      <w:bookmarkStart w:id="22" w:name="_Toc181798340"/>
       <w:r>
         <w:rPr>
           <w:rFonts w:asciiTheme="minorHAnsi" w:hAnsiTheme="minorHAnsi" w:cstheme="minorHAnsi"/>
@@ -5620,7 +5621,7 @@
           <w:szCs w:val="24"/>
         </w:rPr>
       </w:pPr>
-      <w:bookmarkStart w:id="23" w:name="_Toc175669474"/>
+      <w:bookmarkStart w:id="23" w:name="_Toc181798341"/>
       <w:r>
         <w:rPr>
           <w:rFonts w:asciiTheme="minorHAnsi" w:hAnsiTheme="minorHAnsi" w:cstheme="minorHAnsi"/>
@@ -6722,7 +6723,7 @@
       <w:bookmarkStart w:id="25" w:name="_Ref130988974"/>
       <w:bookmarkStart w:id="26" w:name="_Ref130989196"/>
       <w:bookmarkStart w:id="27" w:name="_Ref130989203"/>
-      <w:bookmarkStart w:id="28" w:name="_Toc175669475"/>
+      <w:bookmarkStart w:id="28" w:name="_Toc181798342"/>
       <w:r>
         <w:rPr>
           <w:rFonts w:asciiTheme="minorHAnsi" w:hAnsiTheme="minorHAnsi" w:cstheme="minorHAnsi"/>
@@ -6928,7 +6929,7 @@
           <w:sz w:val="22"/>
           <w:szCs w:val="22"/>
         </w:rPr>
-        <w:t>12.6.2.0</w:t>
+        <w:t>12.6.4.0</w:t>
       </w:r>
       <w:r>
         <w:rPr>
@@ -6998,7 +6999,7 @@
       <w:bookmarkStart w:id="30" w:name="_Toc419800867"/>
       <w:bookmarkStart w:id="31" w:name="_Toc12544355"/>
       <w:bookmarkStart w:id="32" w:name="_Toc21599122"/>
-      <w:bookmarkStart w:id="33" w:name="_Toc175669476"/>
+      <w:bookmarkStart w:id="33" w:name="_Toc181798343"/>
       <w:r>
         <w:rPr>
           <w:rFonts w:asciiTheme="minorHAnsi" w:hAnsiTheme="minorHAnsi" w:cstheme="minorHAnsi"/>
@@ -7250,11 +7251,21 @@
             <w:pPr>
               <w:pStyle w:val="NormTab"/>
             </w:pPr>
-            <w:fldSimple w:instr=" DOCPROPERTY  Versione  \* MERGEFORMAT ">
-              <w:r>
-                <w:t>1.0</w:t>
-              </w:r>
-            </w:fldSimple>
+            <w:r>
+              <w:fldChar w:fldCharType="begin"/>
+            </w:r>
+            <w:r>
+              <w:instrText xml:space="preserve"> DOCPROPERTY  Versione  \* MERGEFORMAT </w:instrText>
+            </w:r>
+            <w:r>
+              <w:fldChar w:fldCharType="separate"/>
+            </w:r>
+            <w:r>
+              <w:t>1.0</w:t>
+            </w:r>
+            <w:r>
+              <w:fldChar w:fldCharType="end"/>
+            </w:r>
           </w:p>
         </w:tc>
         <w:tc>
@@ -7265,11 +7276,21 @@
             <w:pPr>
               <w:pStyle w:val="NormTab"/>
             </w:pPr>
-            <w:fldSimple w:instr=" DOCPROPERTY  &quot;Data Rilascio&quot;  \* MERGEFORMAT ">
-              <w:r>
-                <w:t>30/08/2024</w:t>
-              </w:r>
-            </w:fldSimple>
+            <w:r>
+              <w:fldChar w:fldCharType="begin"/>
+            </w:r>
+            <w:r>
+              <w:instrText xml:space="preserve"> DOCPROPERTY  "Data Rilascio"  \* MERGEFORMAT </w:instrText>
+            </w:r>
+            <w:r>
+              <w:fldChar w:fldCharType="separate"/>
+            </w:r>
+            <w:r>
+              <w:t>30/08/2024</w:t>
+            </w:r>
+            <w:r>
+              <w:fldChar w:fldCharType="end"/>
+            </w:r>
           </w:p>
         </w:tc>
       </w:tr>
@@ -7334,7 +7355,7 @@
       <w:bookmarkStart w:id="35" w:name="_Toc419800868"/>
       <w:bookmarkStart w:id="36" w:name="_Toc12544356"/>
       <w:bookmarkStart w:id="37" w:name="_Toc21599123"/>
-      <w:bookmarkStart w:id="38" w:name="_Toc175669477"/>
+      <w:bookmarkStart w:id="38" w:name="_Toc181798344"/>
       <w:r>
         <w:rPr>
           <w:rFonts w:asciiTheme="minorHAnsi" w:hAnsiTheme="minorHAnsi" w:cstheme="minorHAnsi"/>
@@ -7375,7 +7396,7 @@
       <w:bookmarkStart w:id="40" w:name="_Toc419800870"/>
       <w:bookmarkStart w:id="41" w:name="_Ref13214549"/>
       <w:bookmarkStart w:id="42" w:name="_Toc26961269"/>
-      <w:bookmarkStart w:id="43" w:name="_Toc175669478"/>
+      <w:bookmarkStart w:id="43" w:name="_Toc181798345"/>
       <w:r>
         <w:rPr>
           <w:rFonts w:asciiTheme="minorHAnsi" w:hAnsiTheme="minorHAnsi" w:cstheme="minorHAnsi"/>
@@ -7792,7 +7813,7 @@
         </w:rPr>
       </w:pPr>
       <w:bookmarkStart w:id="46" w:name="_Toc26961270"/>
-      <w:bookmarkStart w:id="47" w:name="_Toc175669479"/>
+      <w:bookmarkStart w:id="47" w:name="_Toc181798346"/>
       <w:r>
         <w:rPr>
           <w:rFonts w:asciiTheme="minorHAnsi" w:hAnsiTheme="minorHAnsi" w:cstheme="minorHAnsi"/>
@@ -8156,7 +8177,7 @@
       <w:bookmarkStart w:id="49" w:name="_Toc419800872"/>
       <w:bookmarkStart w:id="50" w:name="_Toc12544360"/>
       <w:bookmarkStart w:id="51" w:name="_Toc21599124"/>
-      <w:bookmarkStart w:id="52" w:name="_Toc175669480"/>
+      <w:bookmarkStart w:id="52" w:name="_Toc181798347"/>
       <w:bookmarkEnd w:id="44"/>
       <w:bookmarkEnd w:id="45"/>
       <w:bookmarkEnd w:id="46"/>
@@ -9093,7 +9114,6 @@
                 <w:b w:val="0"/>
                 <w:bCs/>
                 <w:sz w:val="20"/>
-                <w:lang w:val="en-GB"/>
               </w:rPr>
             </w:pPr>
             <w:proofErr w:type="gramStart"/>
@@ -9102,7 +9122,6 @@
                 <w:b w:val="0"/>
                 <w:bCs/>
                 <w:sz w:val="20"/>
-                <w:lang w:val="en-GB"/>
               </w:rPr>
               <w:t>sius\de\SIUS_DE_AUTORIZZAFUORISEDEPS.rtf</w:t>
             </w:r>
@@ -9120,7 +9139,6 @@
                 <w:b w:val="0"/>
                 <w:bCs/>
                 <w:sz w:val="20"/>
-                <w:lang w:val="en-GB"/>
               </w:rPr>
             </w:pPr>
             <w:proofErr w:type="gramStart"/>
@@ -9129,7 +9147,6 @@
                 <w:b w:val="0"/>
                 <w:bCs/>
                 <w:sz w:val="20"/>
-                <w:lang w:val="en-GB"/>
               </w:rPr>
               <w:t>sius\de\SIUS_DE_AUTORIZZAGENERICOPS.rtf</w:t>
             </w:r>
@@ -9197,7 +9214,6 @@
                 <w:b w:val="0"/>
                 <w:bCs/>
                 <w:sz w:val="20"/>
-                <w:lang w:val="en-GB"/>
               </w:rPr>
             </w:pPr>
             <w:proofErr w:type="gramStart"/>
@@ -9206,7 +9222,6 @@
                 <w:b w:val="0"/>
                 <w:bCs/>
                 <w:sz w:val="20"/>
-                <w:lang w:val="en-GB"/>
               </w:rPr>
               <w:t>sius\de\SIUS_DE_DIFFIDARISPPRESCRPS.rtf</w:t>
             </w:r>
@@ -9474,18 +9489,18 @@
                 <w:b w:val="0"/>
                 <w:bCs/>
                 <w:sz w:val="20"/>
-                <w:lang w:val="en-GB"/>
-              </w:rPr>
-            </w:pPr>
+              </w:rPr>
+            </w:pPr>
+            <w:proofErr w:type="gramStart"/>
             <w:r>
               <w:rPr>
                 <w:b w:val="0"/>
                 <w:bCs/>
                 <w:sz w:val="20"/>
-                <w:lang w:val="en-GB"/>
               </w:rPr>
               <w:t>sius\de\SIUS_DE_RIGETTOLICPS.rtf</w:t>
             </w:r>
+            <w:proofErr w:type="gramEnd"/>
           </w:p>
           <w:p>
             <w:pPr>
@@ -10314,7 +10329,7 @@
       <w:bookmarkStart w:id="54" w:name="_Toc419800873"/>
       <w:bookmarkStart w:id="55" w:name="_Toc12544361"/>
       <w:bookmarkStart w:id="56" w:name="_Toc21599125"/>
-      <w:bookmarkStart w:id="57" w:name="_Toc175669481"/>
+      <w:bookmarkStart w:id="57" w:name="_Toc181798348"/>
       <w:r>
         <w:rPr>
           <w:rFonts w:asciiTheme="minorHAnsi" w:hAnsiTheme="minorHAnsi" w:cstheme="minorHAnsi"/>
@@ -10351,7 +10366,7 @@
         </w:rPr>
       </w:pPr>
       <w:bookmarkStart w:id="58" w:name="_Toc38010748"/>
-      <w:bookmarkStart w:id="59" w:name="_Toc175669482"/>
+      <w:bookmarkStart w:id="59" w:name="_Toc181798349"/>
       <w:r>
         <w:rPr>
           <w:rFonts w:asciiTheme="minorHAnsi" w:hAnsiTheme="minorHAnsi" w:cstheme="minorHAnsi"/>
@@ -10435,7 +10450,7 @@
           <w:sz w:val="22"/>
           <w:szCs w:val="22"/>
         </w:rPr>
-        <w:t>12.6.2.0</w:t>
+        <w:t>12.6.4.0</w:t>
       </w:r>
       <w:r>
         <w:rPr>
@@ -10474,7 +10489,7 @@
         </w:rPr>
       </w:pPr>
       <w:bookmarkStart w:id="61" w:name="_Toc130471882"/>
-      <w:bookmarkStart w:id="62" w:name="_Toc175669483"/>
+      <w:bookmarkStart w:id="62" w:name="_Toc181798350"/>
       <w:bookmarkEnd w:id="60"/>
       <w:r>
         <w:rPr>
@@ -10720,7 +10735,7 @@
       </w:pPr>
       <w:bookmarkStart w:id="63" w:name="_Toc130471883"/>
       <w:bookmarkStart w:id="64" w:name="_Toc27745470"/>
-      <w:bookmarkStart w:id="65" w:name="_Toc175669484"/>
+      <w:bookmarkStart w:id="65" w:name="_Toc181798351"/>
       <w:r>
         <w:rPr>
           <w:rFonts w:asciiTheme="minorHAnsi" w:hAnsiTheme="minorHAnsi" w:cstheme="minorHAnsi"/>
@@ -10770,7 +10785,7 @@
         </w:rPr>
       </w:pPr>
       <w:bookmarkStart w:id="66" w:name="_Toc130471884"/>
-      <w:bookmarkStart w:id="67" w:name="_Toc175669485"/>
+      <w:bookmarkStart w:id="67" w:name="_Toc181798352"/>
       <w:r>
         <w:rPr>
           <w:rFonts w:asciiTheme="minorHAnsi" w:hAnsiTheme="minorHAnsi" w:cstheme="minorHAnsi"/>
@@ -10818,7 +10833,7 @@
       <w:bookmarkStart w:id="68" w:name="_Toc27745471"/>
       <w:bookmarkStart w:id="69" w:name="_Toc130471885"/>
       <w:bookmarkStart w:id="70" w:name="_Hlk38463154"/>
-      <w:bookmarkStart w:id="71" w:name="_Toc175669486"/>
+      <w:bookmarkStart w:id="71" w:name="_Toc181798353"/>
       <w:r>
         <w:rPr>
           <w:rFonts w:asciiTheme="minorHAnsi" w:hAnsiTheme="minorHAnsi" w:cstheme="minorHAnsi"/>
@@ -12411,7 +12426,7 @@
       <w:bookmarkStart w:id="72" w:name="_Toc27745472"/>
       <w:bookmarkStart w:id="73" w:name="_Toc130471886"/>
       <w:bookmarkStart w:id="74" w:name="_Hlk38463271"/>
-      <w:bookmarkStart w:id="75" w:name="_Toc175669487"/>
+      <w:bookmarkStart w:id="75" w:name="_Toc181798354"/>
       <w:r>
         <w:rPr>
           <w:rFonts w:asciiTheme="minorHAnsi" w:hAnsiTheme="minorHAnsi" w:cstheme="minorHAnsi"/>
@@ -12455,7 +12470,7 @@
       <w:bookmarkStart w:id="80" w:name="_Ref130989110"/>
       <w:bookmarkStart w:id="81" w:name="_Ref130989115"/>
       <w:bookmarkStart w:id="82" w:name="_Ref130989124"/>
-      <w:bookmarkStart w:id="83" w:name="_Toc175669488"/>
+      <w:bookmarkStart w:id="83" w:name="_Toc181798355"/>
       <w:bookmarkEnd w:id="74"/>
       <w:r>
         <w:rPr>
@@ -13437,7 +13452,7 @@
           <w:szCs w:val="24"/>
         </w:rPr>
       </w:pPr>
-      <w:bookmarkStart w:id="84" w:name="_Toc175669489"/>
+      <w:bookmarkStart w:id="84" w:name="_Toc181798356"/>
       <w:r>
         <w:rPr>
           <w:rFonts w:asciiTheme="minorHAnsi" w:hAnsiTheme="minorHAnsi" w:cstheme="minorHAnsi"/>
@@ -13491,7 +13506,7 @@
           <w:szCs w:val="24"/>
         </w:rPr>
       </w:pPr>
-      <w:bookmarkStart w:id="85" w:name="_Toc175669490"/>
+      <w:bookmarkStart w:id="85" w:name="_Toc181798357"/>
       <w:r>
         <w:rPr>
           <w:rFonts w:asciiTheme="minorHAnsi" w:hAnsiTheme="minorHAnsi" w:cstheme="minorHAnsi"/>
@@ -13842,7 +13857,7 @@
               <w:sz w:val="16"/>
               <w:szCs w:val="22"/>
             </w:rPr>
-            <w:t>12</w:t>
+            <w:t>4</w:t>
           </w:r>
           <w:r>
             <w:rPr>
@@ -21286,7 +21301,7 @@
 </file>
 
 <file path=customXml/itemProps1.xml><?xml version="1.0" encoding="utf-8"?>
-<ds:datastoreItem xmlns:ds="http://schemas.openxmlformats.org/officeDocument/2006/customXml" ds:itemID="{A8BA506D-506E-47D3-8EB1-08D57DE02AB7}">
+<ds:datastoreItem xmlns:ds="http://schemas.openxmlformats.org/officeDocument/2006/customXml" ds:itemID="{A85A568F-CA29-40C4-ADF8-1F3951AE5495}">
   <ds:schemaRefs>
     <ds:schemaRef ds:uri="http://schemas.openxmlformats.org/officeDocument/2006/bibliography"/>
   </ds:schemaRefs>

</xml_diff>